<commit_message>
Brand manual v1.3: confirm title, trademark status and logo ownership
Co-Authored-By: Claude Sonnet 5.5 <noreply@anthropic.com>
Claude-Session: https://claude.ai/code/session_018jDBFuhwKs7cJuoJEaEV2i
</commit_message>
<xml_diff>
--- a/docs/Power_Designs_Web_Brand_Manual_v1.2.docx
+++ b/docs/Power_Designs_Web_Brand_Manual_v1.2.docx
@@ -13092,7 +13092,7 @@
           <w:b/>
           <w:bCs/>
         </w:rPr>
-        <w:t>Trademark ownership and permitted use: no registered trademark is confirmed [To confirm]. Risk to manage: powerdesigns.co.za belongs to another agency with a similar name, so never use that domain and consider a trademark search.</w:t>
+        <w:t>Trademark ownership and permitted use: no registered trademark is confirmed. Confirmed by Tia Power on 29 Oct 2026: the name and logo are not registered as trademarks. Risk to manage: powerdesigns.co.za belongs to another agency with a similar name, so never use that domain and consider a trademark search.</w:t>
       </w:r>
     </w:p>
     <w:p>
@@ -13111,7 +13111,7 @@
           <w:b/>
           <w:bCs/>
         </w:rPr>
-        <w:t>Logo, design and intellectual-property rights: Tia Power as owner of the logo and website designs [To confirm]. Rights in client work are set out in the service agreement.</w:t>
+        <w:t>Logo, design and intellectual-property rights: Tia Power as owner of the logo and website designs (confirmed by Tia Power on 29 Oct 2026, for the logo). Rights in client work are set out in the service agreement.</w:t>
       </w:r>
     </w:p>
     <w:p>
@@ -14124,6 +14124,121 @@
           </w:p>
         </w:tc>
       </w:tr>
+      <w:tr>
+        <w:trPr>
+          <w:tblCellSpacing w:w="15" w:type="dxa"/>
+        </w:trPr>
+        <w:tc>
+          <w:tcPr>
+            <w:tcW w:w="0" w:type="auto"/>
+            <w:vAlign w:val="center"/>
+            <w:hideMark/>
+          </w:tcPr>
+          <w:p>
+            <w:pPr>
+              <w:rPr>
+                <w:b/>
+                <w:bCs/>
+              </w:rPr>
+            </w:pPr>
+            <w:r>
+              <w:rPr>
+                <w:b/>
+                <w:bCs/>
+              </w:rPr>
+              <w:t>1.3</w:t>
+            </w:r>
+          </w:p>
+        </w:tc>
+        <w:tc>
+          <w:tcPr>
+            <w:tcW w:w="0" w:type="auto"/>
+            <w:vAlign w:val="center"/>
+            <w:hideMark/>
+          </w:tcPr>
+          <w:p>
+            <w:pPr>
+              <w:rPr>
+                <w:b/>
+                <w:bCs/>
+              </w:rPr>
+            </w:pPr>
+            <w:r>
+              <w:rPr>
+                <w:b/>
+                <w:bCs/>
+              </w:rPr>
+              <w:t>29 Oct 2026</w:t>
+            </w:r>
+          </w:p>
+        </w:tc>
+        <w:tc>
+          <w:tcPr>
+            <w:tcW w:w="0" w:type="auto"/>
+            <w:vAlign w:val="center"/>
+            <w:hideMark/>
+          </w:tcPr>
+          <w:p>
+            <w:pPr>
+              <w:rPr>
+                <w:b/>
+                <w:bCs/>
+              </w:rPr>
+            </w:pPr>
+            <w:r>
+              <w:rPr>
+                <w:b/>
+                <w:bCs/>
+              </w:rPr>
+              <w:t>Confirmed signatory title (Operations Manager), trademark status (not registered) and logo ownership (Tia Power)</w:t>
+            </w:r>
+          </w:p>
+        </w:tc>
+        <w:tc>
+          <w:tcPr>
+            <w:tcW w:w="0" w:type="auto"/>
+            <w:vAlign w:val="center"/>
+            <w:hideMark/>
+          </w:tcPr>
+          <w:p>
+            <w:pPr>
+              <w:rPr>
+                <w:b/>
+                <w:bCs/>
+              </w:rPr>
+            </w:pPr>
+            <w:r>
+              <w:rPr>
+                <w:b/>
+                <w:bCs/>
+              </w:rPr>
+              <w:t>Claude, for Tia Power</w:t>
+            </w:r>
+          </w:p>
+        </w:tc>
+        <w:tc>
+          <w:tcPr>
+            <w:tcW w:w="0" w:type="auto"/>
+            <w:vAlign w:val="center"/>
+            <w:hideMark/>
+          </w:tcPr>
+          <w:p>
+            <w:pPr>
+              <w:rPr>
+                <w:b/>
+                <w:bCs/>
+              </w:rPr>
+            </w:pPr>
+            <w:r>
+              <w:rPr>
+                <w:b/>
+                <w:bCs/>
+              </w:rPr>
+              <w:t>Pending</w:t>
+            </w:r>
+          </w:p>
+        </w:tc>
+      </w:tr>
     </w:tbl>
     <w:p>
       <w:pPr>
@@ -14230,7 +14345,7 @@
           <w:b/>
           <w:bCs/>
         </w:rPr>
-        <w:t>Position: Owner [To confirm title]</w:t>
+        <w:t>Position: Operations Manager</w:t>
       </w:r>
     </w:p>
     <w:p>
@@ -14417,7 +14532,7 @@
           <w:b/>
           <w:bCs/>
         </w:rPr>
-        <w:t>Legal details: registered name, registration number, trademark and logo ownership (sections 1, 7 and 19).</w:t>
+        <w:t>Legal details: registered name and registration number. Trademark status (not registered) and logo ownership (Tia Power) are now confirmed.</w:t>
       </w:r>
     </w:p>
     <w:p>

</xml_diff>